<commit_message>
Anotado el patron de conductividad HI7031L como patron del TDS, con la equivalencia a 707 ppm
</commit_message>
<xml_diff>
--- a/docs/18_PLAN_DE_LA_SEMANA.docx
+++ b/docs/18_PLAN_DE_LA_SEMANA.docx
@@ -1737,7 +1737,7 @@
                 <w:b w:val="0"/>
                 <w:sz w:val="20"/>
               </w:rPr>
-              <w:t>KCl 3 M o solución de almacenamiento</w:t>
+              <w:t>Solución de almacenamiento Hanna HI 70300-023</w:t>
             </w:r>
           </w:p>
         </w:tc>
@@ -1751,7 +1751,7 @@
                 <w:b w:val="0"/>
                 <w:sz w:val="20"/>
               </w:rPr>
-              <w:t>recuperar y guardar el electrodo</w:t>
+              <w:t>recuperar y guardar el electrodo (es el KCl que no aparecía)</w:t>
             </w:r>
           </w:p>
         </w:tc>
@@ -1765,7 +1765,7 @@
                 <w:b w:val="0"/>
                 <w:sz w:val="20"/>
               </w:rPr>
-              <w:t>alta, el lunes</w:t>
+              <w:t>encontrada el martes: hay que pedir cotización</w:t>
             </w:r>
           </w:p>
         </w:tc>
@@ -1869,7 +1869,7 @@
                 <w:b w:val="0"/>
                 <w:sz w:val="20"/>
               </w:rPr>
-              <w:t>Solución patrón de 707 ppm</w:t>
+              <w:t>Patrón de conductividad Hanna HI7031L de 1413 µS/cm, 500 ml</w:t>
             </w:r>
           </w:p>
         </w:tc>
@@ -1897,7 +1897,7 @@
                 <w:b w:val="0"/>
                 <w:sz w:val="20"/>
               </w:rPr>
-              <w:t>media</w:t>
+              <w:t>encontrado el martes, 115,42 Bs</w:t>
             </w:r>
           </w:p>
         </w:tc>
@@ -2080,6 +2080,87 @@
       </w:tr>
     </w:tbl>
     <w:p/>
+    <w:p>
+      <w:r>
+        <w:rPr>
+          <w:b w:val="0"/>
+          <w:sz w:val="22"/>
+        </w:rPr>
+        <w:t>&gt; Sobre el patrón del TDS. El patrón de conductividad de 1413 µS/cm es el que corresponde:</w:t>
+      </w:r>
+    </w:p>
+    <w:p>
+      <w:r>
+        <w:rPr>
+          <w:b w:val="0"/>
+          <w:sz w:val="22"/>
+        </w:rPr>
+        <w:t>&gt; con el factor que usa el firmware (TDS = conductividad × 500) equivale a 706,5 ppm, o sea los</w:t>
+      </w:r>
+    </w:p>
+    <w:p>
+      <w:r>
+        <w:rPr>
+          <w:b w:val="0"/>
+          <w:sz w:val="22"/>
+        </w:rPr>
+        <w:t>&gt; 707 ppm que cita la bibliografía. No hace falta seguir buscando el de 800 ppm: el número del</w:t>
+      </w:r>
+    </w:p>
+    <w:p>
+      <w:r>
+        <w:rPr>
+          <w:b w:val="0"/>
+          <w:sz w:val="22"/>
+        </w:rPr>
+        <w:t>&gt; documento y el patrón quedan coincidiendo, y el mismo frasco calibra la conductividad y el TDS,</w:t>
+      </w:r>
+    </w:p>
+    <w:p>
+      <w:r>
+        <w:rPr>
+          <w:b w:val="0"/>
+          <w:sz w:val="22"/>
+        </w:rPr>
+        <w:t>&gt; que salen de la misma sonda.</w:t>
+      </w:r>
+    </w:p>
+    <w:p>
+      <w:r>
+        <w:rPr>
+          <w:b w:val="0"/>
+          <w:sz w:val="22"/>
+        </w:rPr>
+        <w:t>&gt;</w:t>
+      </w:r>
+    </w:p>
+    <w:p>
+      <w:r>
+        <w:rPr>
+          <w:b w:val="0"/>
+          <w:sz w:val="22"/>
+        </w:rPr>
+        <w:t>&gt; Cómo se usa: se echan unos 50 ml en un vaso limpio y ahí se sumerge la sonda; **lo usado no se</w:t>
+      </w:r>
+    </w:p>
+    <w:p>
+      <w:r>
+        <w:rPr>
+          <w:b w:val="0"/>
+          <w:sz w:val="22"/>
+        </w:rPr>
+        <w:t>&gt; devuelve al frasco**, porque la sonda contamina lo que toca. Con 500 ml alcanza para diez</w:t>
+      </w:r>
+    </w:p>
+    <w:p>
+      <w:r>
+        <w:rPr>
+          <w:b w:val="0"/>
+          <w:sz w:val="22"/>
+        </w:rPr>
+        <w:t>&gt; calibraciones, y el frasco dura cinco años sin abrir.</w:t>
+      </w:r>
+    </w:p>
     <w:p>
       <w:r>
         <w:rPr>

</xml_diff>

<commit_message>
Anotada la cotizacion de Hanna Bolivia y corregido el precio del patron de conductividad
</commit_message>
<xml_diff>
--- a/docs/18_PLAN_DE_LA_SEMANA.docx
+++ b/docs/18_PLAN_DE_LA_SEMANA.docx
@@ -1765,7 +1765,7 @@
                 <w:b w:val="0"/>
                 <w:sz w:val="20"/>
               </w:rPr>
-              <w:t>encontrada el martes: hay que pedir cotización</w:t>
+              <w:t>cotizada el martes: 270 Bs (presentación de 230 ml)</w:t>
             </w:r>
           </w:p>
         </w:tc>
@@ -1897,7 +1897,7 @@
                 <w:b w:val="0"/>
                 <w:sz w:val="20"/>
               </w:rPr>
-              <w:t>encontrado el martes, 115,42 Bs</w:t>
+              <w:t>cotizado el martes: 310 Bs</w:t>
             </w:r>
           </w:p>
         </w:tc>
@@ -2159,6 +2159,729 @@
           <w:sz w:val="22"/>
         </w:rPr>
         <w:t>&gt; calibraciones, y el frasco dura cinco años sin abrir.</w:t>
+      </w:r>
+    </w:p>
+    <w:p>
+      <w:pPr>
+        <w:pStyle w:val="Heading2"/>
+      </w:pPr>
+      <w:r>
+        <w:t>3.1 La cotización de Hanna Bolivia, del martes 29/09</w:t>
+      </w:r>
+    </w:p>
+    <w:p>
+      <w:r>
+        <w:rPr>
+          <w:b w:val="0"/>
+          <w:sz w:val="22"/>
+        </w:rPr>
+        <w:t>Llegó la cotización del distribuidor, con validez de 15 días y stock disponible:</w:t>
+      </w:r>
+    </w:p>
+    <w:tbl>
+      <w:tblPr>
+        <w:tblStyle w:val="TableGrid"/>
+        <w:tblW w:type="auto" w:w="0"/>
+        <w:jc w:val="center"/>
+        <w:tblLook w:firstColumn="1" w:firstRow="1" w:lastColumn="0" w:lastRow="0" w:noHBand="0" w:noVBand="1" w:val="04A0"/>
+      </w:tblPr>
+      <w:tblGrid>
+        <w:gridCol w:w="2160"/>
+        <w:gridCol w:w="2160"/>
+        <w:gridCol w:w="2160"/>
+        <w:gridCol w:w="2160"/>
+      </w:tblGrid>
+      <w:tr>
+        <w:tc>
+          <w:tcPr>
+            <w:tcW w:type="dxa" w:w="2160"/>
+          </w:tcPr>
+          <w:p>
+            <w:r>
+              <w:rPr>
+                <w:b/>
+                <w:sz w:val="20"/>
+              </w:rPr>
+              <w:t>N°</w:t>
+            </w:r>
+          </w:p>
+        </w:tc>
+        <w:tc>
+          <w:tcPr>
+            <w:tcW w:type="dxa" w:w="2160"/>
+          </w:tcPr>
+          <w:p>
+            <w:r>
+              <w:rPr>
+                <w:b/>
+                <w:sz w:val="20"/>
+              </w:rPr>
+              <w:t>Código</w:t>
+            </w:r>
+          </w:p>
+        </w:tc>
+        <w:tc>
+          <w:tcPr>
+            <w:tcW w:type="dxa" w:w="2160"/>
+          </w:tcPr>
+          <w:p>
+            <w:r>
+              <w:rPr>
+                <w:b/>
+                <w:sz w:val="20"/>
+              </w:rPr>
+              <w:t>Descripción</w:t>
+            </w:r>
+          </w:p>
+        </w:tc>
+        <w:tc>
+          <w:tcPr>
+            <w:tcW w:type="dxa" w:w="2160"/>
+          </w:tcPr>
+          <w:p>
+            <w:r>
+              <w:rPr>
+                <w:b/>
+                <w:sz w:val="20"/>
+              </w:rPr>
+              <w:t>Precio</w:t>
+            </w:r>
+          </w:p>
+        </w:tc>
+      </w:tr>
+      <w:tr>
+        <w:tc>
+          <w:tcPr>
+            <w:tcW w:type="dxa" w:w="2160"/>
+          </w:tcPr>
+          <w:p>
+            <w:r>
+              <w:rPr>
+                <w:b w:val="0"/>
+                <w:sz w:val="20"/>
+              </w:rPr>
+              <w:t>1</w:t>
+            </w:r>
+          </w:p>
+        </w:tc>
+        <w:tc>
+          <w:tcPr>
+            <w:tcW w:type="dxa" w:w="2160"/>
+          </w:tcPr>
+          <w:p>
+            <w:r>
+              <w:rPr>
+                <w:b w:val="0"/>
+                <w:sz w:val="20"/>
+              </w:rPr>
+              <w:t>HI 7031L</w:t>
+            </w:r>
+          </w:p>
+        </w:tc>
+        <w:tc>
+          <w:tcPr>
+            <w:tcW w:type="dxa" w:w="2160"/>
+          </w:tcPr>
+          <w:p>
+            <w:r>
+              <w:rPr>
+                <w:b w:val="0"/>
+                <w:sz w:val="20"/>
+              </w:rPr>
+              <w:t>Solución de conductividad 1413 µS/cm, 500 ml</w:t>
+            </w:r>
+          </w:p>
+        </w:tc>
+        <w:tc>
+          <w:tcPr>
+            <w:tcW w:type="dxa" w:w="2160"/>
+          </w:tcPr>
+          <w:p>
+            <w:r>
+              <w:rPr>
+                <w:b w:val="0"/>
+                <w:sz w:val="20"/>
+              </w:rPr>
+              <w:t>310 Bs</w:t>
+            </w:r>
+          </w:p>
+        </w:tc>
+      </w:tr>
+      <w:tr>
+        <w:tc>
+          <w:tcPr>
+            <w:tcW w:type="dxa" w:w="2160"/>
+          </w:tcPr>
+          <w:p>
+            <w:r>
+              <w:rPr>
+                <w:b w:val="0"/>
+                <w:sz w:val="20"/>
+              </w:rPr>
+              <w:t>2</w:t>
+            </w:r>
+          </w:p>
+        </w:tc>
+        <w:tc>
+          <w:tcPr>
+            <w:tcW w:type="dxa" w:w="2160"/>
+          </w:tcPr>
+          <w:p>
+            <w:r>
+              <w:rPr>
+                <w:b w:val="0"/>
+                <w:sz w:val="20"/>
+              </w:rPr>
+              <w:t>HI 70300M</w:t>
+            </w:r>
+          </w:p>
+        </w:tc>
+        <w:tc>
+          <w:tcPr>
+            <w:tcW w:type="dxa" w:w="2160"/>
+          </w:tcPr>
+          <w:p>
+            <w:r>
+              <w:rPr>
+                <w:b w:val="0"/>
+                <w:sz w:val="20"/>
+              </w:rPr>
+              <w:t>Solución de almacenamiento para electrodos, 230 ml</w:t>
+            </w:r>
+          </w:p>
+        </w:tc>
+        <w:tc>
+          <w:tcPr>
+            <w:tcW w:type="dxa" w:w="2160"/>
+          </w:tcPr>
+          <w:p>
+            <w:r>
+              <w:rPr>
+                <w:b w:val="0"/>
+                <w:sz w:val="20"/>
+              </w:rPr>
+              <w:t>270 Bs</w:t>
+            </w:r>
+          </w:p>
+        </w:tc>
+      </w:tr>
+      <w:tr>
+        <w:tc>
+          <w:tcPr>
+            <w:tcW w:type="dxa" w:w="2160"/>
+          </w:tcPr>
+          <w:p>
+            <w:r>
+              <w:rPr>
+                <w:b w:val="0"/>
+                <w:sz w:val="20"/>
+              </w:rPr>
+              <w:t>3</w:t>
+            </w:r>
+          </w:p>
+        </w:tc>
+        <w:tc>
+          <w:tcPr>
+            <w:tcW w:type="dxa" w:w="2160"/>
+          </w:tcPr>
+          <w:p>
+            <w:r>
+              <w:rPr>
+                <w:b w:val="0"/>
+                <w:sz w:val="20"/>
+              </w:rPr>
+              <w:t>HI 7007L/C</w:t>
+            </w:r>
+          </w:p>
+        </w:tc>
+        <w:tc>
+          <w:tcPr>
+            <w:tcW w:type="dxa" w:w="2160"/>
+          </w:tcPr>
+          <w:p>
+            <w:r>
+              <w:rPr>
+                <w:b w:val="0"/>
+                <w:sz w:val="20"/>
+              </w:rPr>
+              <w:t>Solución de pH 7,01, 500 ml con certificado</w:t>
+            </w:r>
+          </w:p>
+        </w:tc>
+        <w:tc>
+          <w:tcPr>
+            <w:tcW w:type="dxa" w:w="2160"/>
+          </w:tcPr>
+          <w:p>
+            <w:r>
+              <w:rPr>
+                <w:b w:val="0"/>
+                <w:sz w:val="20"/>
+              </w:rPr>
+              <w:t>280 Bs</w:t>
+            </w:r>
+          </w:p>
+        </w:tc>
+      </w:tr>
+      <w:tr>
+        <w:tc>
+          <w:tcPr>
+            <w:tcW w:type="dxa" w:w="2160"/>
+          </w:tcPr>
+          <w:p>
+            <w:r>
+              <w:rPr>
+                <w:b w:val="0"/>
+                <w:sz w:val="20"/>
+              </w:rPr>
+              <w:t>4</w:t>
+            </w:r>
+          </w:p>
+        </w:tc>
+        <w:tc>
+          <w:tcPr>
+            <w:tcW w:type="dxa" w:w="2160"/>
+          </w:tcPr>
+          <w:p>
+            <w:r>
+              <w:rPr>
+                <w:b w:val="0"/>
+                <w:sz w:val="20"/>
+              </w:rPr>
+              <w:t>HI 7004L/C</w:t>
+            </w:r>
+          </w:p>
+        </w:tc>
+        <w:tc>
+          <w:tcPr>
+            <w:tcW w:type="dxa" w:w="2160"/>
+          </w:tcPr>
+          <w:p>
+            <w:r>
+              <w:rPr>
+                <w:b w:val="0"/>
+                <w:sz w:val="20"/>
+              </w:rPr>
+              <w:t>Solución de pH 4,01, 500 ml con certificado</w:t>
+            </w:r>
+          </w:p>
+        </w:tc>
+        <w:tc>
+          <w:tcPr>
+            <w:tcW w:type="dxa" w:w="2160"/>
+          </w:tcPr>
+          <w:p>
+            <w:r>
+              <w:rPr>
+                <w:b w:val="0"/>
+                <w:sz w:val="20"/>
+              </w:rPr>
+              <w:t>280 Bs</w:t>
+            </w:r>
+          </w:p>
+        </w:tc>
+      </w:tr>
+      <w:tr>
+        <w:tc>
+          <w:tcPr>
+            <w:tcW w:type="dxa" w:w="2160"/>
+          </w:tcPr>
+          <w:p>
+            <w:r>
+              <w:rPr>
+                <w:b w:val="0"/>
+                <w:sz w:val="20"/>
+              </w:rPr>
+              <w:t>5</w:t>
+            </w:r>
+          </w:p>
+        </w:tc>
+        <w:tc>
+          <w:tcPr>
+            <w:tcW w:type="dxa" w:w="2160"/>
+          </w:tcPr>
+          <w:p>
+            <w:r>
+              <w:rPr>
+                <w:b w:val="0"/>
+                <w:sz w:val="20"/>
+              </w:rPr>
+              <w:t>HI 7061L</w:t>
+            </w:r>
+          </w:p>
+        </w:tc>
+        <w:tc>
+          <w:tcPr>
+            <w:tcW w:type="dxa" w:w="2160"/>
+          </w:tcPr>
+          <w:p>
+            <w:r>
+              <w:rPr>
+                <w:b w:val="0"/>
+                <w:sz w:val="20"/>
+              </w:rPr>
+              <w:t>Solución de limpieza de electrodos, 500 ml</w:t>
+            </w:r>
+          </w:p>
+        </w:tc>
+        <w:tc>
+          <w:tcPr>
+            <w:tcW w:type="dxa" w:w="2160"/>
+          </w:tcPr>
+          <w:p>
+            <w:r>
+              <w:rPr>
+                <w:b w:val="0"/>
+                <w:sz w:val="20"/>
+              </w:rPr>
+              <w:t>310 Bs</w:t>
+            </w:r>
+          </w:p>
+        </w:tc>
+      </w:tr>
+      <w:tr>
+        <w:tc>
+          <w:tcPr>
+            <w:tcW w:type="dxa" w:w="2160"/>
+          </w:tcPr>
+          <w:p>
+            <w:r>
+              <w:rPr>
+                <w:b w:val="0"/>
+                <w:sz w:val="20"/>
+              </w:rPr>
+              <w:t>6</w:t>
+            </w:r>
+          </w:p>
+        </w:tc>
+        <w:tc>
+          <w:tcPr>
+            <w:tcW w:type="dxa" w:w="2160"/>
+          </w:tcPr>
+          <w:p>
+            <w:r>
+              <w:rPr>
+                <w:b w:val="0"/>
+                <w:sz w:val="20"/>
+              </w:rPr>
+              <w:t>420301</w:t>
+            </w:r>
+          </w:p>
+        </w:tc>
+        <w:tc>
+          <w:tcPr>
+            <w:tcW w:type="dxa" w:w="2160"/>
+          </w:tcPr>
+          <w:p>
+            <w:r>
+              <w:rPr>
+                <w:b w:val="0"/>
+                <w:sz w:val="20"/>
+              </w:rPr>
+              <w:t>Gastos de despacho</w:t>
+            </w:r>
+          </w:p>
+        </w:tc>
+        <w:tc>
+          <w:tcPr>
+            <w:tcW w:type="dxa" w:w="2160"/>
+          </w:tcPr>
+          <w:p>
+            <w:r>
+              <w:rPr>
+                <w:b w:val="0"/>
+                <w:sz w:val="20"/>
+              </w:rPr>
+              <w:t>85 Bs</w:t>
+            </w:r>
+          </w:p>
+        </w:tc>
+      </w:tr>
+      <w:tr>
+        <w:tc>
+          <w:tcPr>
+            <w:tcW w:type="dxa" w:w="2160"/>
+          </w:tcPr>
+          <w:p>
+            <w:r>
+              <w:rPr>
+                <w:b w:val="0"/>
+                <w:sz w:val="20"/>
+              </w:rPr>
+            </w:r>
+          </w:p>
+        </w:tc>
+        <w:tc>
+          <w:tcPr>
+            <w:tcW w:type="dxa" w:w="2160"/>
+          </w:tcPr>
+          <w:p>
+            <w:r>
+              <w:rPr>
+                <w:b w:val="0"/>
+                <w:sz w:val="20"/>
+              </w:rPr>
+            </w:r>
+          </w:p>
+        </w:tc>
+        <w:tc>
+          <w:tcPr>
+            <w:tcW w:type="dxa" w:w="2160"/>
+          </w:tcPr>
+          <w:p>
+            <w:r>
+              <w:rPr>
+                <w:b w:val="0"/>
+                <w:sz w:val="20"/>
+              </w:rPr>
+              <w:t>Total de la cotización completa</w:t>
+            </w:r>
+          </w:p>
+        </w:tc>
+        <w:tc>
+          <w:tcPr>
+            <w:tcW w:type="dxa" w:w="2160"/>
+          </w:tcPr>
+          <w:p>
+            <w:r>
+              <w:rPr>
+                <w:b w:val="0"/>
+                <w:sz w:val="20"/>
+              </w:rPr>
+              <w:t>1.535 Bs</w:t>
+            </w:r>
+          </w:p>
+        </w:tc>
+      </w:tr>
+    </w:tbl>
+    <w:p/>
+    <w:p>
+      <w:r>
+        <w:rPr>
+          <w:b w:val="0"/>
+          <w:sz w:val="22"/>
+        </w:rPr>
+        <w:t>Se compran los dos primeros, que son los que el proyecto necesita. Total a pagar:</w:t>
+      </w:r>
+    </w:p>
+    <w:p>
+      <w:r>
+        <w:rPr>
+          <w:b w:val="0"/>
+          <w:sz w:val="22"/>
+        </w:rPr>
+        <w:t>665 Bs (310 + 270 + 85), es decir 870 Bs menos que la cotización completa.</w:t>
+      </w:r>
+    </w:p>
+    <w:tbl>
+      <w:tblPr>
+        <w:tblStyle w:val="TableGrid"/>
+        <w:tblW w:type="auto" w:w="0"/>
+        <w:jc w:val="center"/>
+        <w:tblLook w:firstColumn="1" w:firstRow="1" w:lastColumn="0" w:lastRow="0" w:noHBand="0" w:noVBand="1" w:val="04A0"/>
+      </w:tblPr>
+      <w:tblGrid>
+        <w:gridCol w:w="4320"/>
+        <w:gridCol w:w="4320"/>
+      </w:tblGrid>
+      <w:tr>
+        <w:tc>
+          <w:tcPr>
+            <w:tcW w:type="dxa" w:w="4320"/>
+          </w:tcPr>
+          <w:p>
+            <w:r>
+              <w:rPr>
+                <w:b/>
+                <w:sz w:val="20"/>
+              </w:rPr>
+              <w:t>No se compra</w:t>
+            </w:r>
+          </w:p>
+        </w:tc>
+        <w:tc>
+          <w:tcPr>
+            <w:tcW w:type="dxa" w:w="4320"/>
+          </w:tcPr>
+          <w:p>
+            <w:r>
+              <w:rPr>
+                <w:b/>
+                <w:sz w:val="20"/>
+              </w:rPr>
+              <w:t>Por qué</w:t>
+            </w:r>
+          </w:p>
+        </w:tc>
+      </w:tr>
+      <w:tr>
+        <w:tc>
+          <w:tcPr>
+            <w:tcW w:type="dxa" w:w="4320"/>
+          </w:tcPr>
+          <w:p>
+            <w:r>
+              <w:rPr>
+                <w:b w:val="0"/>
+                <w:sz w:val="20"/>
+              </w:rPr>
+              <w:t>HI 7007L/C y HI 7004L/C</w:t>
+            </w:r>
+          </w:p>
+        </w:tc>
+        <w:tc>
+          <w:tcPr>
+            <w:tcW w:type="dxa" w:w="4320"/>
+          </w:tcPr>
+          <w:p>
+            <w:r>
+              <w:rPr>
+                <w:b w:val="0"/>
+                <w:sz w:val="20"/>
+              </w:rPr>
+              <w:t>Los patrones de pH ya se tienen en sobres de polvo de 4,01 y 6,86</w:t>
+            </w:r>
+          </w:p>
+        </w:tc>
+      </w:tr>
+      <w:tr>
+        <w:tc>
+          <w:tcPr>
+            <w:tcW w:type="dxa" w:w="4320"/>
+          </w:tcPr>
+          <w:p>
+            <w:r>
+              <w:rPr>
+                <w:b w:val="0"/>
+                <w:sz w:val="20"/>
+              </w:rPr>
+              <w:t>HI 7061L</w:t>
+            </w:r>
+          </w:p>
+        </w:tc>
+        <w:tc>
+          <w:tcPr>
+            <w:tcW w:type="dxa" w:w="4320"/>
+          </w:tcPr>
+          <w:p>
+            <w:r>
+              <w:rPr>
+                <w:b w:val="0"/>
+                <w:sz w:val="20"/>
+              </w:rPr>
+              <w:t>La solución de limpieza no es lo que este electrodo necesita: necesita rehidratarse</w:t>
+            </w:r>
+          </w:p>
+        </w:tc>
+      </w:tr>
+    </w:tbl>
+    <w:p/>
+    <w:p>
+      <w:r>
+        <w:rPr>
+          <w:b w:val="0"/>
+          <w:sz w:val="22"/>
+        </w:rPr>
+        <w:t>&gt; Si el presupuesto aprieta, primero la solución de almacenamiento (270 + 85 = 355 Bs), porque</w:t>
+      </w:r>
+    </w:p>
+    <w:p>
+      <w:r>
+        <w:rPr>
+          <w:b w:val="0"/>
+          <w:sz w:val="22"/>
+        </w:rPr>
+        <w:t>&gt; sin ella cualquier electrodo de pH se seca y muere, incluso uno nuevo. El patrón de conductividad</w:t>
+      </w:r>
+    </w:p>
+    <w:p>
+      <w:r>
+        <w:rPr>
+          <w:b w:val="0"/>
+          <w:sz w:val="22"/>
+        </w:rPr>
+        <w:t>&gt; puede esperar: el TDS ya se publica, y lo que aporta es la calibración fina.</w:t>
+      </w:r>
+    </w:p>
+    <w:p>
+      <w:r>
+        <w:rPr>
+          <w:b w:val="0"/>
+          <w:sz w:val="22"/>
+        </w:rPr>
+        <w:t>&gt;</w:t>
+      </w:r>
+    </w:p>
+    <w:p>
+      <w:r>
+        <w:rPr>
+          <w:b w:val="0"/>
+          <w:sz w:val="22"/>
+        </w:rPr>
+        <w:t>&gt; Y vale un último intento por el KCl antes de pagarlo: si el laboratorio de la universidad o una</w:t>
+      </w:r>
+    </w:p>
+    <w:p>
+      <w:r>
+        <w:rPr>
+          <w:b w:val="0"/>
+          <w:sz w:val="22"/>
+        </w:rPr>
+        <w:t>&gt; droguería pueden dar cloruro de potasio, la solución de almacenamiento se prepara en casa</w:t>
+      </w:r>
+    </w:p>
+    <w:p>
+      <w:r>
+        <w:rPr>
+          <w:b w:val="0"/>
+          <w:sz w:val="22"/>
+        </w:rPr>
+        <w:t>&gt; (KCl 3 M en agua destilada) y se ahorran los 270 Bs. El patrón de conductividad, en cambio, no</w:t>
+      </w:r>
+    </w:p>
+    <w:p>
+      <w:r>
+        <w:rPr>
+          <w:b w:val="0"/>
+          <w:sz w:val="22"/>
+        </w:rPr>
+        <w:t>&gt; conviene prepararlo: es 0,01 M de KCl y necesita balanza de precisión, así que el certificado de</w:t>
+      </w:r>
+    </w:p>
+    <w:p>
+      <w:r>
+        <w:rPr>
+          <w:b w:val="0"/>
+          <w:sz w:val="22"/>
+        </w:rPr>
+        <w:t>&gt; Hanna es lo que corresponde comprar.</w:t>
+      </w:r>
+    </w:p>
+    <w:p>
+      <w:r>
+        <w:rPr>
+          <w:b w:val="0"/>
+          <w:sz w:val="22"/>
+        </w:rPr>
+        <w:t>&gt; Ojo con el total de la semana. A estos 665 Bs se le pueden sumar los 280 o 320 Bs de la</w:t>
+      </w:r>
+    </w:p>
+    <w:p>
+      <w:r>
+        <w:rPr>
+          <w:b w:val="0"/>
+          <w:sz w:val="22"/>
+        </w:rPr>
+        <w:t>&gt; sonda de pH, si el electrodo no revive el miércoles. La semana puede cerrar cerca de 985 Bs,</w:t>
+      </w:r>
+    </w:p>
+    <w:p>
+      <w:r>
+        <w:rPr>
+          <w:b w:val="0"/>
+          <w:sz w:val="22"/>
+        </w:rPr>
+        <w:t>&gt; así que conviene decidir la compra de Hanna junto con la del electrodo, no por separado.</w:t>
       </w:r>
     </w:p>
     <w:p>

</xml_diff>

<commit_message>
Anotado el pedido de Hanna: cotizacion 66917, con el despacho a 35 Bs y el total en 615 Bs
</commit_message>
<xml_diff>
--- a/docs/18_PLAN_DE_LA_SEMANA.docx
+++ b/docs/18_PLAN_DE_LA_SEMANA.docx
@@ -2661,7 +2661,15 @@
           <w:b w:val="0"/>
           <w:sz w:val="22"/>
         </w:rPr>
-        <w:t>Se compran los dos primeros, que son los que el proyecto necesita. Total a pagar:</w:t>
+        <w:t>Se compran los dos primeros, que son los que el proyecto necesita.</w:t>
+      </w:r>
+    </w:p>
+    <w:p>
+      <w:pPr>
+        <w:pStyle w:val="Heading2"/>
+      </w:pPr>
+      <w:r>
+        <w:t>3.2 El pedido, hecho el 30 de septiembre · cotización N° 66917</w:t>
       </w:r>
     </w:p>
     <w:p>
@@ -2670,7 +2678,382 @@
           <w:b w:val="0"/>
           <w:sz w:val="22"/>
         </w:rPr>
-        <w:t>665 Bs (310 + 270 + 85), es decir 870 Bs menos que la cotización completa.</w:t>
+        <w:t>Sobre esa base se emitió una segunda cotización (N° 66917, del 29/09, con vigencia hasta el</w:t>
+      </w:r>
+    </w:p>
+    <w:p>
+      <w:r>
+        <w:rPr>
+          <w:b w:val="0"/>
+          <w:sz w:val="22"/>
+        </w:rPr>
+        <w:t>14/10) que baja el despacho de 85 a 35 Bs:</w:t>
+      </w:r>
+    </w:p>
+    <w:tbl>
+      <w:tblPr>
+        <w:tblStyle w:val="TableGrid"/>
+        <w:tblW w:type="auto" w:w="0"/>
+        <w:jc w:val="center"/>
+        <w:tblLook w:firstColumn="1" w:firstRow="1" w:lastColumn="0" w:lastRow="0" w:noHBand="0" w:noVBand="1" w:val="04A0"/>
+      </w:tblPr>
+      <w:tblGrid>
+        <w:gridCol w:w="2160"/>
+        <w:gridCol w:w="2160"/>
+        <w:gridCol w:w="2160"/>
+        <w:gridCol w:w="2160"/>
+      </w:tblGrid>
+      <w:tr>
+        <w:tc>
+          <w:tcPr>
+            <w:tcW w:type="dxa" w:w="2160"/>
+          </w:tcPr>
+          <w:p>
+            <w:r>
+              <w:rPr>
+                <w:b/>
+                <w:sz w:val="20"/>
+              </w:rPr>
+              <w:t>N°</w:t>
+            </w:r>
+          </w:p>
+        </w:tc>
+        <w:tc>
+          <w:tcPr>
+            <w:tcW w:type="dxa" w:w="2160"/>
+          </w:tcPr>
+          <w:p>
+            <w:r>
+              <w:rPr>
+                <w:b/>
+                <w:sz w:val="20"/>
+              </w:rPr>
+              <w:t>Código</w:t>
+            </w:r>
+          </w:p>
+        </w:tc>
+        <w:tc>
+          <w:tcPr>
+            <w:tcW w:type="dxa" w:w="2160"/>
+          </w:tcPr>
+          <w:p>
+            <w:r>
+              <w:rPr>
+                <w:b/>
+                <w:sz w:val="20"/>
+              </w:rPr>
+              <w:t>Descripción</w:t>
+            </w:r>
+          </w:p>
+        </w:tc>
+        <w:tc>
+          <w:tcPr>
+            <w:tcW w:type="dxa" w:w="2160"/>
+          </w:tcPr>
+          <w:p>
+            <w:r>
+              <w:rPr>
+                <w:b/>
+                <w:sz w:val="20"/>
+              </w:rPr>
+              <w:t>Precio</w:t>
+            </w:r>
+          </w:p>
+        </w:tc>
+      </w:tr>
+      <w:tr>
+        <w:tc>
+          <w:tcPr>
+            <w:tcW w:type="dxa" w:w="2160"/>
+          </w:tcPr>
+          <w:p>
+            <w:r>
+              <w:rPr>
+                <w:b w:val="0"/>
+                <w:sz w:val="20"/>
+              </w:rPr>
+              <w:t>1</w:t>
+            </w:r>
+          </w:p>
+        </w:tc>
+        <w:tc>
+          <w:tcPr>
+            <w:tcW w:type="dxa" w:w="2160"/>
+          </w:tcPr>
+          <w:p>
+            <w:r>
+              <w:rPr>
+                <w:b w:val="0"/>
+                <w:sz w:val="20"/>
+              </w:rPr>
+              <w:t>HI 7031L</w:t>
+            </w:r>
+          </w:p>
+        </w:tc>
+        <w:tc>
+          <w:tcPr>
+            <w:tcW w:type="dxa" w:w="2160"/>
+          </w:tcPr>
+          <w:p>
+            <w:r>
+              <w:rPr>
+                <w:b w:val="0"/>
+                <w:sz w:val="20"/>
+              </w:rPr>
+              <w:t>Solución de conductividad 1413 µS/cm, 500 ml</w:t>
+            </w:r>
+          </w:p>
+        </w:tc>
+        <w:tc>
+          <w:tcPr>
+            <w:tcW w:type="dxa" w:w="2160"/>
+          </w:tcPr>
+          <w:p>
+            <w:r>
+              <w:rPr>
+                <w:b w:val="0"/>
+                <w:sz w:val="20"/>
+              </w:rPr>
+              <w:t>310 Bs</w:t>
+            </w:r>
+          </w:p>
+        </w:tc>
+      </w:tr>
+      <w:tr>
+        <w:tc>
+          <w:tcPr>
+            <w:tcW w:type="dxa" w:w="2160"/>
+          </w:tcPr>
+          <w:p>
+            <w:r>
+              <w:rPr>
+                <w:b w:val="0"/>
+                <w:sz w:val="20"/>
+              </w:rPr>
+              <w:t>2</w:t>
+            </w:r>
+          </w:p>
+        </w:tc>
+        <w:tc>
+          <w:tcPr>
+            <w:tcW w:type="dxa" w:w="2160"/>
+          </w:tcPr>
+          <w:p>
+            <w:r>
+              <w:rPr>
+                <w:b w:val="0"/>
+                <w:sz w:val="20"/>
+              </w:rPr>
+              <w:t>HI 70300M</w:t>
+            </w:r>
+          </w:p>
+        </w:tc>
+        <w:tc>
+          <w:tcPr>
+            <w:tcW w:type="dxa" w:w="2160"/>
+          </w:tcPr>
+          <w:p>
+            <w:r>
+              <w:rPr>
+                <w:b w:val="0"/>
+                <w:sz w:val="20"/>
+              </w:rPr>
+              <w:t>Solución de almacenamiento para electrodos, 230 ml</w:t>
+            </w:r>
+          </w:p>
+        </w:tc>
+        <w:tc>
+          <w:tcPr>
+            <w:tcW w:type="dxa" w:w="2160"/>
+          </w:tcPr>
+          <w:p>
+            <w:r>
+              <w:rPr>
+                <w:b w:val="0"/>
+                <w:sz w:val="20"/>
+              </w:rPr>
+              <w:t>270 Bs</w:t>
+            </w:r>
+          </w:p>
+        </w:tc>
+      </w:tr>
+      <w:tr>
+        <w:tc>
+          <w:tcPr>
+            <w:tcW w:type="dxa" w:w="2160"/>
+          </w:tcPr>
+          <w:p>
+            <w:r>
+              <w:rPr>
+                <w:b w:val="0"/>
+                <w:sz w:val="20"/>
+              </w:rPr>
+              <w:t>3</w:t>
+            </w:r>
+          </w:p>
+        </w:tc>
+        <w:tc>
+          <w:tcPr>
+            <w:tcW w:type="dxa" w:w="2160"/>
+          </w:tcPr>
+          <w:p>
+            <w:r>
+              <w:rPr>
+                <w:b w:val="0"/>
+                <w:sz w:val="20"/>
+              </w:rPr>
+              <w:t>420301</w:t>
+            </w:r>
+          </w:p>
+        </w:tc>
+        <w:tc>
+          <w:tcPr>
+            <w:tcW w:type="dxa" w:w="2160"/>
+          </w:tcPr>
+          <w:p>
+            <w:r>
+              <w:rPr>
+                <w:b w:val="0"/>
+                <w:sz w:val="20"/>
+              </w:rPr>
+              <w:t>Gastos de despacho</w:t>
+            </w:r>
+          </w:p>
+        </w:tc>
+        <w:tc>
+          <w:tcPr>
+            <w:tcW w:type="dxa" w:w="2160"/>
+          </w:tcPr>
+          <w:p>
+            <w:r>
+              <w:rPr>
+                <w:b w:val="0"/>
+                <w:sz w:val="20"/>
+              </w:rPr>
+              <w:t>35 Bs</w:t>
+            </w:r>
+          </w:p>
+        </w:tc>
+      </w:tr>
+      <w:tr>
+        <w:tc>
+          <w:tcPr>
+            <w:tcW w:type="dxa" w:w="2160"/>
+          </w:tcPr>
+          <w:p>
+            <w:r>
+              <w:rPr>
+                <w:b w:val="0"/>
+                <w:sz w:val="20"/>
+              </w:rPr>
+            </w:r>
+          </w:p>
+        </w:tc>
+        <w:tc>
+          <w:tcPr>
+            <w:tcW w:type="dxa" w:w="2160"/>
+          </w:tcPr>
+          <w:p>
+            <w:r>
+              <w:rPr>
+                <w:b w:val="0"/>
+                <w:sz w:val="20"/>
+              </w:rPr>
+            </w:r>
+          </w:p>
+        </w:tc>
+        <w:tc>
+          <w:tcPr>
+            <w:tcW w:type="dxa" w:w="2160"/>
+          </w:tcPr>
+          <w:p>
+            <w:r>
+              <w:rPr>
+                <w:b w:val="0"/>
+                <w:sz w:val="20"/>
+              </w:rPr>
+              <w:t>Total del pedido</w:t>
+            </w:r>
+          </w:p>
+        </w:tc>
+        <w:tc>
+          <w:tcPr>
+            <w:tcW w:type="dxa" w:w="2160"/>
+          </w:tcPr>
+          <w:p>
+            <w:r>
+              <w:rPr>
+                <w:b w:val="0"/>
+                <w:sz w:val="20"/>
+              </w:rPr>
+              <w:t>615 Bs</w:t>
+            </w:r>
+          </w:p>
+        </w:tc>
+      </w:tr>
+    </w:tbl>
+    <w:p/>
+    <w:p>
+      <w:r>
+        <w:rPr>
+          <w:b w:val="0"/>
+          <w:sz w:val="22"/>
+        </w:rPr>
+        <w:t>El pedido está hecho. Quedan por confirmar la fecha de entrega y el número de lote con su</w:t>
+      </w:r>
+    </w:p>
+    <w:p>
+      <w:r>
+        <w:rPr>
+          <w:b w:val="0"/>
+          <w:sz w:val="22"/>
+        </w:rPr>
+        <w:t>vencimiento, que conviene pedir cuando respondan. Se espera que llegue antes del fin de semana.</w:t>
+      </w:r>
+    </w:p>
+    <w:p>
+      <w:r>
+        <w:rPr>
+          <w:b w:val="0"/>
+          <w:sz w:val="22"/>
+        </w:rPr>
+        <w:t>&gt; Qué cambia si llega antes del sábado. El patrón de conductividad permite calibrar el TDS y la</w:t>
+      </w:r>
+    </w:p>
+    <w:p>
+      <w:r>
+        <w:rPr>
+          <w:b w:val="0"/>
+          <w:sz w:val="22"/>
+        </w:rPr>
+        <w:t>&gt; conductividad, y esa calibración se puede sumar al E3 como evidencia. Si llega después, va al E4,</w:t>
+      </w:r>
+    </w:p>
+    <w:p>
+      <w:r>
+        <w:rPr>
+          <w:b w:val="0"/>
+          <w:sz w:val="22"/>
+        </w:rPr>
+        <w:t>&gt; que es donde el informe de calibración tiene su lugar. La solución de almacenamiento, en cambio,</w:t>
+      </w:r>
+    </w:p>
+    <w:p>
+      <w:r>
+        <w:rPr>
+          <w:b w:val="0"/>
+          <w:sz w:val="22"/>
+        </w:rPr>
+        <w:t>&gt; conviene tenerla cuanto antes: es lo que mantiene vivo el electrodo, sea el que se recuperó o el</w:t>
+      </w:r>
+    </w:p>
+    <w:p>
+      <w:r>
+        <w:rPr>
+          <w:b w:val="0"/>
+          <w:sz w:val="22"/>
+        </w:rPr>
+        <w:t>&gt; que se compre nuevo.</w:t>
       </w:r>
     </w:p>
     <w:tbl>
@@ -2782,7 +3165,7 @@
           <w:b w:val="0"/>
           <w:sz w:val="22"/>
         </w:rPr>
-        <w:t>&gt; Si el presupuesto aprieta, primero la solución de almacenamiento (270 + 85 = 355 Bs), porque</w:t>
+        <w:t>&gt; Si el presupuesto aprieta, primero la solución de almacenamiento, porque sin ella cualquier</w:t>
       </w:r>
     </w:p>
     <w:p>
@@ -2791,7 +3174,7 @@
           <w:b w:val="0"/>
           <w:sz w:val="22"/>
         </w:rPr>
-        <w:t>&gt; sin ella cualquier electrodo de pH se seca y muere, incluso uno nuevo. El patrón de conductividad</w:t>
+        <w:t>&gt; electrodo de pH se seca y muere, incluso uno nuevo. El patrón de conductividad puede esperar: el</w:t>
       </w:r>
     </w:p>
     <w:p>
@@ -2800,7 +3183,7 @@
           <w:b w:val="0"/>
           <w:sz w:val="22"/>
         </w:rPr>
-        <w:t>&gt; puede esperar: el TDS ya se publica, y lo que aporta es la calibración fina.</w:t>
+        <w:t>&gt; TDS ya se publica, y lo que aporta es la calibración fina.</w:t>
       </w:r>
     </w:p>
     <w:p>
@@ -2854,7 +3237,7 @@
           <w:b w:val="0"/>
           <w:sz w:val="22"/>
         </w:rPr>
-        <w:t>&gt; Hanna es lo que corresponde comprar.</w:t>
+        <w:t>&gt; Hanna es lo que corresponde comprar. *(El 30/09 apareció una alternativa de KCl 3 M de Mettler</w:t>
       </w:r>
     </w:p>
     <w:p>
@@ -2863,7 +3246,7 @@
           <w:b w:val="0"/>
           <w:sz w:val="22"/>
         </w:rPr>
-        <w:t>&gt; Ojo con el total de la semana. A estos 665 Bs se le pueden sumar los 280 o 320 Bs de la</w:t>
+        <w:t>&gt; Toledo en 250 ml, en cotización: si llega a buen precio, reemplaza a la de Hanna.)*</w:t>
       </w:r>
     </w:p>
     <w:p>
@@ -2872,7 +3255,7 @@
           <w:b w:val="0"/>
           <w:sz w:val="22"/>
         </w:rPr>
-        <w:t>&gt; sonda de pH, si el electrodo no revive el miércoles. La semana puede cerrar cerca de 985 Bs,</w:t>
+        <w:t>&gt; Ojo con el total de la semana. A estos 615 Bs se le pueden sumar los 280 o 320 Bs de la</w:t>
       </w:r>
     </w:p>
     <w:p>
@@ -2881,7 +3264,16 @@
           <w:b w:val="0"/>
           <w:sz w:val="22"/>
         </w:rPr>
-        <w:t>&gt; así que conviene decidir la compra de Hanna junto con la del electrodo, no por separado.</w:t>
+        <w:t>&gt; sonda de pH, si el electrodo no revive el miércoles. La semana puede cerrar cerca de 935 Bs,</w:t>
+      </w:r>
+    </w:p>
+    <w:p>
+      <w:r>
+        <w:rPr>
+          <w:b w:val="0"/>
+          <w:sz w:val="22"/>
+        </w:rPr>
+        <w:t>&gt; así que conviene decidir la compra del electrodo apenas se sepa el resultado de la prueba.</w:t>
       </w:r>
     </w:p>
     <w:p>

</xml_diff>